<commit_message>
Matchs Ete 9: XXXXX dans les cases restantes des enfants elimines
David Van Bommel 13.2 et Samuel Van Bommel 9.1 elimines des Eglantiers:
cases Jeu 27/08 a Dim 30/08 remplies avec XXXXX.

Co-Authored-By: Claude Opus 4.8 <noreply@anthropic.com>
Claude-Session: https://claude.ai/code/session_013WShXcCyBkE1H1x1qzmtZK
</commit_message>
<xml_diff>
--- a/Liste_des_matchs_Ete_9_mercredi.docx
+++ b/Liste_des_matchs_Ete_9_mercredi.docx
@@ -410,25 +410,41 @@
           <w:tcPr>
             <w:tcW w:w="984" w:type="dxa"/>
           </w:tcPr>
-          <w:p/>
+          <w:p>
+            <w:r>
+              <w:t>XXXXX</w:t>
+            </w:r>
+          </w:p>
         </w:tc>
         <w:tc>
           <w:tcPr>
             <w:tcW w:w="847" w:type="dxa"/>
           </w:tcPr>
-          <w:p/>
+          <w:p>
+            <w:r>
+              <w:t>XXXXX</w:t>
+            </w:r>
+          </w:p>
         </w:tc>
         <w:tc>
           <w:tcPr>
             <w:tcW w:w="976" w:type="dxa"/>
           </w:tcPr>
-          <w:p/>
+          <w:p>
+            <w:r>
+              <w:t>XXXXX</w:t>
+            </w:r>
+          </w:p>
         </w:tc>
         <w:tc>
           <w:tcPr>
             <w:tcW w:w="1109" w:type="dxa"/>
           </w:tcPr>
-          <w:p/>
+          <w:p>
+            <w:r>
+              <w:t>XXXXX</w:t>
+            </w:r>
+          </w:p>
         </w:tc>
       </w:tr>
       <w:tr>
@@ -478,25 +494,41 @@
           <w:tcPr>
             <w:tcW w:w="984" w:type="dxa"/>
           </w:tcPr>
-          <w:p/>
+          <w:p>
+            <w:r>
+              <w:t>XXXXX</w:t>
+            </w:r>
+          </w:p>
         </w:tc>
         <w:tc>
           <w:tcPr>
             <w:tcW w:w="847" w:type="dxa"/>
           </w:tcPr>
-          <w:p/>
+          <w:p>
+            <w:r>
+              <w:t>XXXXX</w:t>
+            </w:r>
+          </w:p>
         </w:tc>
         <w:tc>
           <w:tcPr>
             <w:tcW w:w="976" w:type="dxa"/>
           </w:tcPr>
-          <w:p/>
+          <w:p>
+            <w:r>
+              <w:t>XXXXX</w:t>
+            </w:r>
+          </w:p>
         </w:tc>
         <w:tc>
           <w:tcPr>
             <w:tcW w:w="1109" w:type="dxa"/>
           </w:tcPr>
-          <w:p/>
+          <w:p>
+            <w:r>
+              <w:t>XXXXX</w:t>
+            </w:r>
+          </w:p>
         </w:tc>
       </w:tr>
       <w:tr>

</xml_diff>

<commit_message>
Matchs Ete 9: ajout horaires vendredi 28/08 (Eglantiers/Le Chalet)
Ven 28/08 depuis les prochains matchs AFT:
- Samuel Van Bommel 9.2: 15.15
- Lucas Wozny 11.1: 12.00 ; 11.2: 14.00
- Gus Denis M2: 17.30
- Riccardo Pirnay 13.2: NC ; Vytautas Razauskas M3: NC (Eglantiers et Le Chalet)
Riccardo 11.1 elimine jeudi: XXXXX de Ven 28/08 a Dim 30/08.

Co-Authored-By: Claude Opus 4.8 <noreply@anthropic.com>
Claude-Session: https://claude.ai/code/session_013WShXcCyBkE1H1x1qzmtZK
</commit_message>
<xml_diff>
--- a/Liste_des_matchs_Ete_9_mercredi.docx
+++ b/Liste_des_matchs_Ete_9_mercredi.docx
@@ -280,19 +280,31 @@
           <w:tcPr>
             <w:tcW w:w="847" w:type="dxa"/>
           </w:tcPr>
-          <w:p/>
+          <w:p>
+            <w:r>
+              <w:t>XXXXX</w:t>
+            </w:r>
+          </w:p>
         </w:tc>
         <w:tc>
           <w:tcPr>
             <w:tcW w:w="976" w:type="dxa"/>
           </w:tcPr>
-          <w:p/>
+          <w:p>
+            <w:r>
+              <w:t>XXXXX</w:t>
+            </w:r>
+          </w:p>
         </w:tc>
         <w:tc>
           <w:tcPr>
             <w:tcW w:w="1109" w:type="dxa"/>
           </w:tcPr>
-          <w:p/>
+          <w:p>
+            <w:r>
+              <w:t>XXXXX</w:t>
+            </w:r>
+          </w:p>
         </w:tc>
       </w:tr>
       <w:tr>
@@ -348,7 +360,11 @@
           <w:tcPr>
             <w:tcW w:w="847" w:type="dxa"/>
           </w:tcPr>
-          <w:p/>
+          <w:p>
+            <w:r>
+              <w:t>NC</w:t>
+            </w:r>
+          </w:p>
         </w:tc>
         <w:tc>
           <w:tcPr>
@@ -584,7 +600,11 @@
           <w:tcPr>
             <w:tcW w:w="847" w:type="dxa"/>
           </w:tcPr>
-          <w:p/>
+          <w:p>
+            <w:r>
+              <w:t>15.15</w:t>
+            </w:r>
+          </w:p>
         </w:tc>
         <w:tc>
           <w:tcPr>
@@ -656,7 +676,11 @@
           <w:tcPr>
             <w:tcW w:w="847" w:type="dxa"/>
           </w:tcPr>
-          <w:p/>
+          <w:p>
+            <w:r>
+              <w:t>12.00</w:t>
+            </w:r>
+          </w:p>
         </w:tc>
         <w:tc>
           <w:tcPr>
@@ -724,7 +748,11 @@
           <w:tcPr>
             <w:tcW w:w="847" w:type="dxa"/>
           </w:tcPr>
-          <w:p/>
+          <w:p>
+            <w:r>
+              <w:t>14.00</w:t>
+            </w:r>
+          </w:p>
         </w:tc>
         <w:tc>
           <w:tcPr>
@@ -792,7 +820,11 @@
           <w:tcPr>
             <w:tcW w:w="847" w:type="dxa"/>
           </w:tcPr>
-          <w:p/>
+          <w:p>
+            <w:r>
+              <w:t>17.30</w:t>
+            </w:r>
+          </w:p>
         </w:tc>
         <w:tc>
           <w:tcPr>
@@ -860,7 +892,11 @@
           <w:tcPr>
             <w:tcW w:w="847" w:type="dxa"/>
           </w:tcPr>
-          <w:p/>
+          <w:p>
+            <w:r>
+              <w:t>NC</w:t>
+            </w:r>
+          </w:p>
         </w:tc>
         <w:tc>
           <w:tcPr>
@@ -1095,7 +1131,11 @@
           <w:tcPr>
             <w:tcW w:w="847" w:type="dxa"/>
           </w:tcPr>
-          <w:p/>
+          <w:p>
+            <w:r>
+              <w:t>NC</w:t>
+            </w:r>
+          </w:p>
         </w:tc>
         <w:tc>
           <w:tcPr>

</xml_diff>

<commit_message>
Matchs Ete 9: colonne samedi 29/08 + eliminations vendredi
Sam 29/08 depuis les prochains matchs AFT (Eglantiers/Le Chalet):
- Riccardo Pirnay 13.2: NC ; Vytautas Razauskas M3: NC (Eglantiers et Le Chalet)
- Elimines vendredi (XXXXX Sam 29 et Dim 30): Samuel Van Bommel 9.2,
  Lucas Wozny 11.1 et 11.2, Gus Denis M2.

Co-Authored-By: Claude Opus 4.8 <noreply@anthropic.com>
Claude-Session: https://claude.ai/code/session_013WShXcCyBkE1H1x1qzmtZK
</commit_message>
<xml_diff>
--- a/Liste_des_matchs_Ete_9_mercredi.docx
+++ b/Liste_des_matchs_Ete_9_mercredi.docx
@@ -370,7 +370,11 @@
           <w:tcPr>
             <w:tcW w:w="976" w:type="dxa"/>
           </w:tcPr>
-          <w:p/>
+          <w:p>
+            <w:r>
+              <w:t>NC</w:t>
+            </w:r>
+          </w:p>
         </w:tc>
         <w:tc>
           <w:tcPr>
@@ -610,13 +614,21 @@
           <w:tcPr>
             <w:tcW w:w="976" w:type="dxa"/>
           </w:tcPr>
-          <w:p/>
+          <w:p>
+            <w:r>
+              <w:t>XXXXX</w:t>
+            </w:r>
+          </w:p>
         </w:tc>
         <w:tc>
           <w:tcPr>
             <w:tcW w:w="1109" w:type="dxa"/>
           </w:tcPr>
-          <w:p/>
+          <w:p>
+            <w:r>
+              <w:t>XXXXX</w:t>
+            </w:r>
+          </w:p>
         </w:tc>
       </w:tr>
       <w:tr>
@@ -686,13 +698,21 @@
           <w:tcPr>
             <w:tcW w:w="976" w:type="dxa"/>
           </w:tcPr>
-          <w:p/>
+          <w:p>
+            <w:r>
+              <w:t>XXXXX</w:t>
+            </w:r>
+          </w:p>
         </w:tc>
         <w:tc>
           <w:tcPr>
             <w:tcW w:w="1109" w:type="dxa"/>
           </w:tcPr>
-          <w:p/>
+          <w:p>
+            <w:r>
+              <w:t>XXXXX</w:t>
+            </w:r>
+          </w:p>
         </w:tc>
       </w:tr>
       <w:tr>
@@ -758,13 +778,21 @@
           <w:tcPr>
             <w:tcW w:w="976" w:type="dxa"/>
           </w:tcPr>
-          <w:p/>
+          <w:p>
+            <w:r>
+              <w:t>XXXXX</w:t>
+            </w:r>
+          </w:p>
         </w:tc>
         <w:tc>
           <w:tcPr>
             <w:tcW w:w="1109" w:type="dxa"/>
           </w:tcPr>
-          <w:p/>
+          <w:p>
+            <w:r>
+              <w:t>XXXXX</w:t>
+            </w:r>
+          </w:p>
         </w:tc>
       </w:tr>
       <w:tr>
@@ -830,13 +858,21 @@
           <w:tcPr>
             <w:tcW w:w="976" w:type="dxa"/>
           </w:tcPr>
-          <w:p/>
+          <w:p>
+            <w:r>
+              <w:t>XXXXX</w:t>
+            </w:r>
+          </w:p>
         </w:tc>
         <w:tc>
           <w:tcPr>
             <w:tcW w:w="1109" w:type="dxa"/>
           </w:tcPr>
-          <w:p/>
+          <w:p>
+            <w:r>
+              <w:t>XXXXX</w:t>
+            </w:r>
+          </w:p>
         </w:tc>
       </w:tr>
       <w:tr>
@@ -902,7 +938,11 @@
           <w:tcPr>
             <w:tcW w:w="976" w:type="dxa"/>
           </w:tcPr>
-          <w:p/>
+          <w:p>
+            <w:r>
+              <w:t>NC</w:t>
+            </w:r>
+          </w:p>
         </w:tc>
         <w:tc>
           <w:tcPr>
@@ -1141,7 +1181,11 @@
           <w:tcPr>
             <w:tcW w:w="976" w:type="dxa"/>
           </w:tcPr>
-          <w:p/>
+          <w:p>
+            <w:r>
+              <w:t>NC</w:t>
+            </w:r>
+          </w:p>
         </w:tc>
         <w:tc>
           <w:tcPr>

</xml_diff>